<commit_message>
fix: replace fabricated tool counts with verified real numbers
300+ and 10,000+ were made up. Actual verified counts:
- claude-plugins.dev: 51,000+ agent skills (source: site header)
- glama.ai: 20,000+ MCP servers (source: API pagination + site)
- Smithery: 2,880-5,000+ MCP servers

Updated README intro paragraph and all three instances in launch plan.
Regenerated .docx.

Co-Authored-By: Claude Sonnet 4.6 <noreply@anthropic.com>
</commit_message>
<xml_diff>
--- a/docs/launch-plan-week1.docx
+++ b/docs/launch-plan-week1.docx
@@ -82,7 +82,7 @@
         <w:t xml:space="preserve"> </w:t>
       </w:r>
       <w:r>
-        <w:t xml:space="preserve">The CC ecosystem has 300+ plugins, skills, and MCPs across 16 domains — and it grows every week. Developers discover maybe 10% of it by browsing, asking around, or stumbling onto something. When you switch from React to n8n, CC reaches for the tool it used yesterday, not the best tool for today’s task. Nobody told it anything changed. Nobody told YOU what exists.</w:t>
+        <w:t xml:space="preserve">The CC ecosystem has 51,000+ agent skills on claude-plugins.dev alone, 20,000+ MCP servers on glama.ai, and more on Smithery — across 16 domains — and it grows every week. Developers discover maybe 10% of it by browsing, asking around, or stumbling onto something. When you switch from React to n8n, CC reaches for the tool it used yesterday, not the best tool for today’s task. Nobody told it anything changed. Nobody told YOU what exists.</w:t>
       </w:r>
     </w:p>
     <w:p>
@@ -1977,7 +1977,7 @@
         <w:t xml:space="preserve">“</w:t>
       </w:r>
       <w:r>
-        <w:t xml:space="preserve">The Claude Code ecosystem has 300+ tools. CC only knows about the ones it’s seen before.</w:t>
+        <w:t xml:space="preserve">The Claude Code ecosystem has 70,000+ tools across skills, MCPs, and plugins. CC only knows about the ones it’s seen before.</w:t>
       </w:r>
       <w:r>
         <w:t xml:space="preserve">”</w:t>
@@ -2324,7 +2324,7 @@
         <w:t xml:space="preserve">“</w:t>
       </w:r>
       <w:r>
-        <w:t xml:space="preserve">There are 300+ CC tools in the marketplace. You’re probably using 20. Here’s what you’re missing for your current task.</w:t>
+        <w:t xml:space="preserve">There are 70,000+ tools in the CC ecosystem. You’re probably using 20. Here’s what you’re missing for your current task.</w:t>
       </w:r>
       <w:r>
         <w:t xml:space="preserve">”</w:t>

</xml_diff>